<commit_message>
Release VCF Offline Depot 1.1.0 documentation
Update revision 1.9 guides, roadmap 3.7, release notes, and signed-download verification for build 2026-09-07.1. Document the ESX ISO download fix, permanent Depot Management controls, and consistent navigation.
</commit_message>
<xml_diff>
--- a/VCF-Offline-Depot-Administrator-Guide.docx
+++ b/VCF-Offline-Depot-Administrator-Guide.docx
@@ -27,7 +27,7 @@
         <w:t>Release baseline:</w:t>
       </w:r>
       <w:r>
-        <w:t xml:space="preserve"> Appliance 1.0.0 - distribution build 2026-09-05.2</w:t>
+        <w:t xml:space="preserve"> Appliance 1.1.0 - distribution build 2026-09-07.1</w:t>
       </w:r>
     </w:p>
     <w:p>
@@ -39,7 +39,7 @@
         <w:t>Documentation revision:</w:t>
       </w:r>
       <w:r>
-        <w:t xml:space="preserve"> 1.8 — 5 September 2026</w:t>
+        <w:t xml:space="preserve"> 1.9 — 7 September 2026</w:t>
       </w:r>
     </w:p>
     <w:p>
@@ -51,7 +51,7 @@
         <w:t>Release status:</w:t>
       </w:r>
       <w:r>
-        <w:t xml:space="preserve"> The previously agreed VCF Installer-only 1.0 GA acceptance work and R01 remain complete. This rebuilt OVA is ready for manual replacement deployment testing; fresh deployment and VCF Installer acceptance of this exact image are pending. SDDC Manager and Fleet Manager qualification (T04) remains deferred.</w:t>
+        <w:t xml:space="preserve"> Version 1.1.0 maintenance release. Consult the signed release record for validation of this exact OVA. VCF Installer remains the supported integration scope; SDDC Manager and Fleet Manager qualification remains deferred.</w:t>
       </w:r>
     </w:p>
     <w:p>
@@ -83,12 +83,112 @@
         <w:pStyle w:val="Heading1"/>
       </w:pPr>
       <w:r>
+        <w:t>Bootable ESX installer media</w:t>
+      </w:r>
+    </w:p>
+    <w:p>
+      <w:r>
+        <w:t xml:space="preserve">Choose </w:t>
+      </w:r>
+      <w:r>
+        <w:rPr>
+          <w:b/>
+        </w:rPr>
+        <w:t>Install, including ESXi media</w:t>
+      </w:r>
+      <w:r>
+        <w:t xml:space="preserve"> when downloading installation binaries. After the main VCF download, the appliance reads the release bill of materials and product catalog, then makes a separate VCF Download Tool request for the matching x86-64 bootable ESX ISO bundle ID. This includes installer media cataloged as PATCH instead of INSTALL. No separate manual ISO upload is required for an available entitled catalog entry.</w:t>
+      </w:r>
+    </w:p>
+    <w:p>
+      <w:r>
+        <w:t xml:space="preserve">The job requires the expected ISO filename, size, and SHA-256 checksum before reporting success. For VCF 9.1.1, the catalog entry is </w:t>
+      </w:r>
+      <w:r>
+        <w:rPr>
+          <w:rFonts w:ascii="Consolas" w:hAnsi="Consolas"/>
+          <w:sz w:val="18"/>
+        </w:rPr>
+        <w:t>VMware-VMvisor-Installer-9.1.1.0.25714478.x86_64.iso</w:t>
+      </w:r>
+      <w:r>
+        <w:t xml:space="preserve">. A missing, ambiguous, or corrupt ISO fails the job instead of accepting a zero-result request. Correct the cause and retry the same release; the tool reuses existing content. Look under the ESX_HOST component in </w:t>
+      </w:r>
+      <w:r>
+        <w:rPr>
+          <w:b/>
+        </w:rPr>
+        <w:t>Depot Files</w:t>
+      </w:r>
+      <w:r>
+        <w:t>. A fresh activation code is required for each new job and is removed after use.</w:t>
+      </w:r>
+    </w:p>
+    <w:p>
+      <w:pPr>
+        <w:pStyle w:val="Heading1"/>
+      </w:pPr>
+      <w:r>
         <w:t>Navigation in this build</w:t>
       </w:r>
     </w:p>
     <w:p>
       <w:r>
-        <w:t xml:space="preserve">During initial setup, open </w:t>
+        <w:t xml:space="preserve">The header provides </w:t>
+      </w:r>
+      <w:r>
+        <w:rPr>
+          <w:b/>
+        </w:rPr>
+        <w:t>Authorize &amp; Download</w:t>
+      </w:r>
+      <w:r>
+        <w:t xml:space="preserve">, </w:t>
+      </w:r>
+      <w:r>
+        <w:rPr>
+          <w:b/>
+        </w:rPr>
+        <w:t>VCF Connections</w:t>
+      </w:r>
+      <w:r>
+        <w:t xml:space="preserve">, </w:t>
+      </w:r>
+      <w:r>
+        <w:rPr>
+          <w:b/>
+        </w:rPr>
+        <w:t>Depot Files</w:t>
+      </w:r>
+      <w:r>
+        <w:t xml:space="preserve">, </w:t>
+      </w:r>
+      <w:r>
+        <w:rPr>
+          <w:b/>
+        </w:rPr>
+        <w:t>Depot Management</w:t>
+      </w:r>
+      <w:r>
+        <w:t xml:space="preserve">, </w:t>
+      </w:r>
+      <w:r>
+        <w:rPr>
+          <w:b/>
+        </w:rPr>
+        <w:t>Connection Logs</w:t>
+      </w:r>
+      <w:r>
+        <w:t xml:space="preserve">, and </w:t>
+      </w:r>
+      <w:r>
+        <w:rPr>
+          <w:b/>
+        </w:rPr>
+        <w:t>Appliance Status</w:t>
+      </w:r>
+      <w:r>
+        <w:t xml:space="preserve">. During initial setup, </w:t>
       </w:r>
       <w:r>
         <w:rPr>
@@ -97,71 +197,67 @@
         <w:t>Prepare Depot</w:t>
       </w:r>
       <w:r>
-        <w:t xml:space="preserve"> and use its sidebar for Download Tool, Authorize &amp; Download Binaries, Depot Accounts, HTTPS Certificate, and VCF Connections. Complete tool installation, depot accounts, and certificate activation before finishing the endpoint connection.</w:t>
-      </w:r>
-    </w:p>
-    <w:p>
-      <w:r>
-        <w:t xml:space="preserve">Once a saved connection reports </w:t>
-      </w:r>
+        <w:t xml:space="preserve"> provides the guided steps for the Download Tool, authorization, Depot Accounts, HTTPS Certificate, and VCF Connections. After a saved endpoint becomes Connected, the setup workflow is hidden.</w:t>
+      </w:r>
+    </w:p>
+    <w:p>
+      <w:r/>
       <w:r>
         <w:rPr>
           <w:b/>
         </w:rPr>
-        <w:t>Connected</w:t>
-      </w:r>
-      <w:r>
-        <w:t xml:space="preserve">, Prepare Depot and its setup sidebar are hidden. The main navigation then shows </w:t>
+        <w:t>Depot Management</w:t>
+      </w:r>
+      <w:r>
+        <w:t xml:space="preserve"> remains available before and after setup. Its three cards open Download Tool, Depot Accounts, and HTTPS Certificate. Use </w:t>
       </w:r>
       <w:r>
         <w:rPr>
           <w:b/>
         </w:rPr>
-        <w:t>Authorize &amp; Download</w:t>
-      </w:r>
-      <w:r>
-        <w:t xml:space="preserve">, </w:t>
+        <w:t>Back to Depot Management</w:t>
+      </w:r>
+      <w:r>
+        <w:t xml:space="preserve"> to return. Maintenance does not require disconnecting or deleting a working endpoint. After rotating depot credentials or renewing the certificate, review affected clients in </w:t>
       </w:r>
       <w:r>
         <w:rPr>
           <w:b/>
         </w:rPr>
-        <w:t>Endpoint Connections</w:t>
-      </w:r>
-      <w:r>
-        <w:t xml:space="preserve">, </w:t>
-      </w:r>
+        <w:t>VCF Connections</w:t>
+      </w:r>
+      <w:r>
+        <w:t xml:space="preserve"> and verify authenticated retrieval.</w:t>
+      </w:r>
+    </w:p>
+    <w:p>
+      <w:r/>
       <w:r>
         <w:rPr>
           <w:b/>
         </w:rPr>
-        <w:t>Offline Depot</w:t>
-      </w:r>
-      <w:r>
-        <w:t xml:space="preserve">, </w:t>
+        <w:t>Depot Files</w:t>
+      </w:r>
+      <w:r>
+        <w:t xml:space="preserve"> opens the </w:t>
       </w:r>
       <w:r>
         <w:rPr>
           <w:b/>
         </w:rPr>
-        <w:t>Connection Logs</w:t>
-      </w:r>
-      <w:r>
-        <w:t xml:space="preserve">, and </w:t>
+        <w:t>Depot File Management</w:t>
+      </w:r>
+      <w:r>
+        <w:t xml:space="preserve"> page for browsing, uploading, and managing release files. </w:t>
       </w:r>
       <w:r>
         <w:rPr>
           <w:b/>
         </w:rPr>
-        <w:t>Health Status</w:t>
-      </w:r>
-      <w:r>
-        <w:t>. A completed setup opens Health Status. Direct links to setup-only pages can return to Health Status; this build does not expose a separate post-setup maintenance entry for those pages. Do not remove a working connection record merely to reveal setup controls.</w:t>
-      </w:r>
-    </w:p>
-    <w:p>
-      <w:r>
-        <w:t xml:space="preserve">Use the administrator account menu for </w:t>
+        <w:t>Appliance Status</w:t>
+      </w:r>
+      <w:r>
+        <w:t xml:space="preserve"> reports health and effective settings. The administrator menu contains </w:t>
       </w:r>
       <w:r>
         <w:rPr>
@@ -188,7 +284,7 @@
         <w:t>Admin user management</w:t>
       </w:r>
       <w:r>
-        <w:t>. Health Status displays effective settings and service health; Appliance management changes settings. In the compact management layout, Identity and Timezone sit side by side above Management network and DNS and time; cards stack on smaller screens. Management network, Upload and verify a release, and Create administrator use normal card borders without the former blue top accent.</w:t>
+        <w:t>; these pages leave the primary header links unhighlighted.</w:t>
       </w:r>
     </w:p>
     <w:p>
@@ -230,7 +326,7 @@
         <w:t>VCF Installer</w:t>
       </w:r>
       <w:r>
-        <w:t>; this exact rebuilt image still requires deployment acceptance. SDDC Manager and Fleet Manager integration is planned for a later qualified update.</w:t>
+        <w:t>. Validate configuration and retrieval in your own environment before replacement. SDDC Manager and Fleet Manager integration is planned for a later qualified update.</w:t>
       </w:r>
     </w:p>
     <w:p>
@@ -1722,7 +1818,7 @@
         <w:rPr>
           <w:b/>
         </w:rPr>
-        <w:t>Health Status</w:t>
+        <w:t>Appliance Status</w:t>
       </w:r>
       <w:r>
         <w:t xml:space="preserve"> and select </w:t>
@@ -2318,7 +2414,7 @@
         <w:rPr>
           <w:b/>
         </w:rPr>
-        <w:t>Health Status</w:t>
+        <w:t>Appliance Status</w:t>
       </w:r>
       <w:r>
         <w:t xml:space="preserve">, select </w:t>
@@ -2410,7 +2506,16 @@
     </w:p>
     <w:p>
       <w:r>
-        <w:t>These account procedures require the initial setup pages. Once setup is complete, this build hides those pages; arrange a supported maintenance procedure before attempting post-setup account changes.</w:t>
+        <w:t xml:space="preserve">These account controls remain available under </w:t>
+      </w:r>
+      <w:r>
+        <w:rPr>
+          <w:b/>
+        </w:rPr>
+        <w:t>Depot Management &gt; Depot Accounts</w:t>
+      </w:r>
+      <w:r>
+        <w:t xml:space="preserve"> after setup. Review each affected endpoint before changing an account.</w:t>
       </w:r>
     </w:p>
     <w:p>
@@ -2442,25 +2547,25 @@
         </w:numPr>
       </w:pPr>
       <w:r>
-        <w:t xml:space="preserve">During initial setup, open </w:t>
+        <w:t xml:space="preserve">Open </w:t>
       </w:r>
       <w:r>
         <w:rPr>
           <w:b/>
         </w:rPr>
-        <w:t>Prepare Depot</w:t>
-      </w:r>
-      <w:r>
-        <w:t xml:space="preserve">, then </w:t>
+        <w:t>Depot Management &gt; Depot Accounts</w:t>
+      </w:r>
+      <w:r>
+        <w:t xml:space="preserve"> (or </w:t>
       </w:r>
       <w:r>
         <w:rPr>
           <w:b/>
         </w:rPr>
-        <w:t>Depot Accounts</w:t>
-      </w:r>
-      <w:r>
-        <w:t>.</w:t>
+        <w:t>Prepare Depot &gt; Depot Accounts</w:t>
+      </w:r>
+      <w:r>
+        <w:t xml:space="preserve"> during initial setup).</w:t>
       </w:r>
     </w:p>
     <w:p>
@@ -2609,25 +2714,25 @@
         </w:numPr>
       </w:pPr>
       <w:r>
-        <w:t xml:space="preserve">During initial setup, open </w:t>
+        <w:t xml:space="preserve">Open </w:t>
       </w:r>
       <w:r>
         <w:rPr>
           <w:b/>
         </w:rPr>
-        <w:t>Prepare Depot</w:t>
-      </w:r>
-      <w:r>
-        <w:t xml:space="preserve">, then </w:t>
+        <w:t>Depot Management &gt; Depot Accounts</w:t>
+      </w:r>
+      <w:r>
+        <w:t xml:space="preserve"> (or </w:t>
       </w:r>
       <w:r>
         <w:rPr>
           <w:b/>
         </w:rPr>
-        <w:t>Depot Accounts</w:t>
-      </w:r>
-      <w:r>
-        <w:t xml:space="preserve"> and select the account.</w:t>
+        <w:t>Prepare Depot &gt; Depot Accounts</w:t>
+      </w:r>
+      <w:r>
+        <w:t xml:space="preserve"> during initial setup) and select the account.</w:t>
       </w:r>
     </w:p>
     <w:p>
@@ -2743,25 +2848,25 @@
         </w:numPr>
       </w:pPr>
       <w:r>
-        <w:t xml:space="preserve">During initial setup, open </w:t>
+        <w:t xml:space="preserve">Open </w:t>
       </w:r>
       <w:r>
         <w:rPr>
           <w:b/>
         </w:rPr>
-        <w:t>Prepare Depot</w:t>
-      </w:r>
-      <w:r>
-        <w:t xml:space="preserve">, then </w:t>
+        <w:t>Depot Management &gt; Depot Accounts</w:t>
+      </w:r>
+      <w:r>
+        <w:t xml:space="preserve"> (or </w:t>
       </w:r>
       <w:r>
         <w:rPr>
           <w:b/>
         </w:rPr>
-        <w:t>Depot Accounts</w:t>
-      </w:r>
-      <w:r>
-        <w:t>.</w:t>
+        <w:t>Prepare Depot &gt; Depot Accounts</w:t>
+      </w:r>
+      <w:r>
+        <w:t xml:space="preserve"> during initial setup).</w:t>
       </w:r>
     </w:p>
     <w:p>
@@ -2860,7 +2965,7 @@
     </w:p>
     <w:p>
       <w:r>
-        <w:t>This GUI workflow is available during initial setup. The Download Tool page is hidden after a connection reaches Connected; do not assume a post-setup tool replacement entry is available in this build.</w:t>
+        <w:t>Open Depot Management to maintain the tool at any time. Let active downloads finish before replacing it.</w:t>
       </w:r>
     </w:p>
     <w:p>
@@ -2908,25 +3013,25 @@
         </w:numPr>
       </w:pPr>
       <w:r>
-        <w:t xml:space="preserve">During initial setup, open </w:t>
+        <w:t xml:space="preserve">Open </w:t>
       </w:r>
       <w:r>
         <w:rPr>
           <w:b/>
         </w:rPr>
-        <w:t>Prepare Depot</w:t>
-      </w:r>
-      <w:r>
-        <w:t xml:space="preserve">, then </w:t>
+        <w:t>Depot Management &gt; Download Tool</w:t>
+      </w:r>
+      <w:r>
+        <w:t xml:space="preserve"> (or </w:t>
       </w:r>
       <w:r>
         <w:rPr>
           <w:b/>
         </w:rPr>
-        <w:t>Download Tool</w:t>
-      </w:r>
-      <w:r>
-        <w:t>.</w:t>
+        <w:t>Prepare Depot &gt; Download Tool</w:t>
+      </w:r>
+      <w:r>
+        <w:t xml:space="preserve"> during initial setup).</w:t>
       </w:r>
     </w:p>
     <w:p>
@@ -3072,7 +3177,7 @@
         </w:numPr>
       </w:pPr>
       <w:r>
-        <w:t>Enter a short-lived access token or use the supported vendor credential exchange.</w:t>
+        <w:t>Select Get Software Depot ID and register it through Broadcom to obtain an entitled activation code.</w:t>
       </w:r>
     </w:p>
     <w:p>
@@ -3084,7 +3189,7 @@
         </w:numPr>
       </w:pPr>
       <w:r>
-        <w:t>Retrieve and verify the Software Depot ID when required.</w:t>
+        <w:t>Verify that the activation code belongs to this appliance Software Depot ID.</w:t>
       </w:r>
     </w:p>
     <w:p>
@@ -3253,7 +3358,7 @@
         <w:rPr>
           <w:b/>
         </w:rPr>
-        <w:t>Offline Depot</w:t>
+        <w:t>Depot Files</w:t>
       </w:r>
       <w:r>
         <w:t>.</w:t>
@@ -3371,7 +3476,16 @@
     </w:p>
     <w:p>
       <w:r>
-        <w:t>The following certificate controls are on the initial setup pages. After setup is complete, review the active HTTPS identity in Health Status; certificate replacement requires a supported maintenance procedure because the setup page is hidden.</w:t>
+        <w:t xml:space="preserve">Open </w:t>
+      </w:r>
+      <w:r>
+        <w:rPr>
+          <w:b/>
+        </w:rPr>
+        <w:t>Depot Management &gt; HTTPS Certificate</w:t>
+      </w:r>
+      <w:r>
+        <w:t xml:space="preserve"> for the following certificate controls. These remain available after setup.</w:t>
       </w:r>
     </w:p>
     <w:p>
@@ -3403,25 +3517,25 @@
         </w:numPr>
       </w:pPr>
       <w:r>
-        <w:t xml:space="preserve">During initial setup, open </w:t>
+        <w:t xml:space="preserve">Open </w:t>
       </w:r>
       <w:r>
         <w:rPr>
           <w:b/>
         </w:rPr>
-        <w:t>Prepare Depot</w:t>
-      </w:r>
-      <w:r>
-        <w:t xml:space="preserve">, then </w:t>
+        <w:t>Depot Management &gt; HTTPS Certificate</w:t>
+      </w:r>
+      <w:r>
+        <w:t xml:space="preserve"> (or </w:t>
       </w:r>
       <w:r>
         <w:rPr>
           <w:b/>
         </w:rPr>
-        <w:t>HTTPS Certificate</w:t>
-      </w:r>
-      <w:r>
-        <w:t>.</w:t>
+        <w:t>Prepare Depot &gt; HTTPS Certificate</w:t>
+      </w:r>
+      <w:r>
+        <w:t xml:space="preserve"> during initial setup).</w:t>
       </w:r>
     </w:p>
     <w:p>
@@ -3506,25 +3620,25 @@
         </w:numPr>
       </w:pPr>
       <w:r>
-        <w:t xml:space="preserve">During initial setup, open </w:t>
+        <w:t xml:space="preserve">Open </w:t>
       </w:r>
       <w:r>
         <w:rPr>
           <w:b/>
         </w:rPr>
-        <w:t>Prepare Depot</w:t>
-      </w:r>
-      <w:r>
-        <w:t xml:space="preserve">, then </w:t>
+        <w:t>Depot Management &gt; HTTPS Certificate</w:t>
+      </w:r>
+      <w:r>
+        <w:t xml:space="preserve"> (or </w:t>
       </w:r>
       <w:r>
         <w:rPr>
           <w:b/>
         </w:rPr>
-        <w:t>HTTPS Certificate</w:t>
-      </w:r>
-      <w:r>
-        <w:t>.</w:t>
+        <w:t>Prepare Depot &gt; HTTPS Certificate</w:t>
+      </w:r>
+      <w:r>
+        <w:t xml:space="preserve"> during initial setup).</w:t>
       </w:r>
     </w:p>
     <w:p>
@@ -3678,25 +3792,25 @@
         </w:numPr>
       </w:pPr>
       <w:r>
-        <w:t xml:space="preserve">During initial setup, open </w:t>
+        <w:t xml:space="preserve">Open </w:t>
       </w:r>
       <w:r>
         <w:rPr>
           <w:b/>
         </w:rPr>
-        <w:t>Prepare Depot</w:t>
-      </w:r>
-      <w:r>
-        <w:t xml:space="preserve">, then </w:t>
+        <w:t>Depot Management &gt; HTTPS Certificate</w:t>
+      </w:r>
+      <w:r>
+        <w:t xml:space="preserve"> (or </w:t>
       </w:r>
       <w:r>
         <w:rPr>
           <w:b/>
         </w:rPr>
-        <w:t>HTTPS Certificate</w:t>
-      </w:r>
-      <w:r>
-        <w:t>.</w:t>
+        <w:t>Prepare Depot &gt; HTTPS Certificate</w:t>
+      </w:r>
+      <w:r>
+        <w:t xml:space="preserve"> during initial setup).</w:t>
       </w:r>
     </w:p>
     <w:p>
@@ -3840,7 +3954,7 @@
         <w:rPr>
           <w:b/>
         </w:rPr>
-        <w:t>Endpoint Connections</w:t>
+        <w:t>VCF Connections</w:t>
       </w:r>
       <w:r>
         <w:t>.</w:t>
@@ -4053,7 +4167,7 @@
         <w:rPr>
           <w:b/>
         </w:rPr>
-        <w:t>Endpoint Connections</w:t>
+        <w:t>VCF Connections</w:t>
       </w:r>
       <w:r>
         <w:t>.</w:t>
@@ -4429,7 +4543,7 @@
         </w:numPr>
       </w:pPr>
       <w:r>
-        <w:t>Correlate the entry with the local status shown on Endpoint Connections.</w:t>
+        <w:t>Correlate the entry with the local status shown on VCF Connections.</w:t>
       </w:r>
     </w:p>
     <w:p>
@@ -4864,7 +4978,7 @@
       <w:jc w:val="right"/>
     </w:pPr>
     <w:r>
-      <w:t xml:space="preserve">Revision 1.8  |  5 September 2026  |  </w:t>
+      <w:t xml:space="preserve">Revision 1.9  |  7 September 2026  |  </w:t>
     </w:r>
     <w:fldSimple w:instr="PAGE"/>
   </w:p>

</xml_diff>